<commit_message>
docs: informe maestro de ingenieria fase 2 con estructura y profundidad formal (Informe_Tecnico_Avance_Fase2_Benjamin_Navarrete.docx)
</commit_message>
<xml_diff>
--- a/Informe_Tecnico_Avance_Fase2_Benjamin_Navarrete.docx
+++ b/Informe_Tecnico_Avance_Fase2_Benjamin_Navarrete.docx
@@ -12,9 +12,9 @@
           <w:rFonts w:ascii="Calibri" w:hAnsi="Calibri"/>
           <w:b/>
           <w:color w:val="0F172A"/>
-          <w:sz w:val="40"/>
+          <w:sz w:val="44"/>
         </w:rPr>
-        <w:t>INFORME TÉCNICO DE AVANCE - FASE 2</w:t>
+        <w:t>INFORME DE INGENIERÍA — FASE 2</w:t>
       </w:r>
     </w:p>
     <w:p>
@@ -29,7 +29,7 @@
           <w:color w:val="1E3A8A"/>
           <w:sz w:val="26"/>
         </w:rPr>
-        <w:t>Desarrollo Core, Arquitectura de Software y Prototipo Operativo (Meta: 7.0)</w:t>
+        <w:t>Desarrollo Core, Arquitectura de Software y Prototipo Funcional Operativo (Meta: 7.0)</w:t>
       </w:r>
     </w:p>
     <w:p>
@@ -44,7 +44,7 @@
           <w:color w:val="64748B"/>
           <w:sz w:val="21"/>
         </w:rPr>
-        <w:t>Proyecto Capstone (APT122 / PTY4614) — Escuela de Informática y Telecomunicaciones — Duoc UC</w:t>
+        <w:t>Proyecto Capstone (APT122 / PTY4614) — Escuela de Informática y Telecomunicaciones — Duoc UC Sede La Florida</w:t>
       </w:r>
     </w:p>
     <w:tbl>
@@ -72,19 +72,23 @@
                 <w:color w:val="0F172A"/>
                 <w:sz w:val="19"/>
               </w:rPr>
-              <w:t>CONTROL DE ENTREGA — HITO SEMANA 9:</w:t>
+              <w:t>DATOS DEL PROYECTO Y CONTROL DE ENTREGA:</w:t>
               <w:br/>
-              <w:t>• Estudiante / Desarrollador Líder: Benjamín Navarrete (Super Administrador)</w:t>
+              <w:t>• Estudiante: Benjamín Abraham Navarrete Hernández | RUT: 21.252.605-3</w:t>
               <w:br/>
-              <w:t>• Correo Super Admin: benjamin54144752123@gmail.com | Clave: Capstone2026!</w:t>
+              <w:t>• Carrera: Ingeniería en Informática / Análisis Programador | Sede: La Florida</w:t>
               <w:br/>
-              <w:t>• Profesor Guía: Diego Garcés M.</w:t>
+              <w:t>• Rol: Super Administrador, Desarrollador Fullstack Líder y Arquitecto de Software</w:t>
+              <w:br/>
+              <w:t>• Docente Guía: Diego Garcés M. | Hito: Avance Fase 2 (Semana 9 - 20% Ponderación)</w:t>
               <w:br/>
               <w:t>• Repositorio Oficial Git: https://github.com/IMANDOI/sistema-gestion-auditorios-capstone</w:t>
               <w:br/>
-              <w:t>• Despliegue en la Nube (Vercel): https://sistema-gestion-auditorios-capstone.vercel.app</w:t>
+              <w:t>• Despliegue en Producción Cloud: https://sistema-gestion-auditorios-capstone.vercel.app</w:t>
               <w:br/>
-              <w:t>• Compilación de Producción: 100% Exitosa (next build - 0 errores, rutas prerenderizadas)</w:t>
+              <w:t>• Entorno Local: http://localhost:3000 (Next.js 15 / React 19 / SQLite / Prisma v6)</w:t>
+              <w:br/>
+              <w:t>• Estado de Compilación: 100% Exitosa (next build - 0 errores, rutas prerenderizadas)</w:t>
             </w:r>
           </w:p>
         </w:tc>
@@ -92,7 +96,7 @@
     </w:tbl>
     <w:p>
       <w:pPr>
-        <w:spacing w:after="120"/>
+        <w:spacing w:after="200"/>
       </w:pPr>
     </w:p>
     <w:p>
@@ -104,9 +108,9 @@
           <w:rFonts w:ascii="Calibri" w:hAnsi="Calibri"/>
           <w:b/>
           <w:color w:val="1E3A8A"/>
-          <w:sz w:val="26"/>
+          <w:sz w:val="28"/>
         </w:rPr>
-        <w:t>1. RESUMEN EJECUTIVO DEL PROYECTO</w:t>
+        <w:t>RESUMEN EJECUTIVO</w:t>
       </w:r>
     </w:p>
     <w:p>
@@ -121,7 +125,7 @@
           <w:color w:val="1E293B"/>
           <w:sz w:val="20"/>
         </w:rPr>
-        <w:t>El presente Informe de Avance de Fase 2 consolida la ingeniería, arquitectura y desarrollo del núcleo de software del Sistema Autónomo de Gestión Operativa, Trazabilidad QR y Rendimiento de Espacios Académicos para la Escuela de Informática y Telecomunicaciones de Duoc UC. El proyecto responde a la ineficiencia histórica originada por la dispersión de reservas en planillas aisladas, el solapamiento de horarios, la falta de trazabilidad en las horas de soporte técnico dedicadas por el personal de TI y la desarticulación con cuadrillas auxiliares (Aseo y Guardia).</w:t>
+        <w:t>El presente Informe de Ingeniería de Avance de Fase 2 formaliza y consolida la transición completa desde los requerimientos, especificaciones y diagramas conceptuales aprobados en la Fase 1, hacia la construcción material, programación del código fuente, persistencia de datos relacional y despliegue del prototipo funcional operativo del Sistema Autónomo de Gestión Operativa de Auditorios y Optimización de Soporte TI.</w:t>
       </w:r>
     </w:p>
     <w:p>
@@ -136,7 +140,7 @@
           <w:color w:val="1E293B"/>
           <w:sz w:val="20"/>
         </w:rPr>
-        <w:t>Durante esta fase se construyó y validó un Producto Mínimo Viable (MVP) completamente operativo bajo el framework Next.js 15 (App Router, Server Actions) y React 19, desacoplado en cinco portales modulares por rol (/login, /docente, /tecnico, /encargado, /admin) bajo pautas de accesibilidad WCAG 2.1 AA. El sistema implementa un motor relacional de 10 entidades en Prisma ORM, validación matemática anti-colisiones, emisión y validación de tokens QR en terreno en menos de 30 segundos, cómputo automatizado de horas dedicadas de soporte TI (Delta T), reprogramación protegida mediante confirmación obligatoria, gestión de cuentas RBAC con doble verificación, motor RPA con 4 bots de contingencia, un Plan de Respuesta a Incidentes (IRP) bajo normas NIST SP 800-61 / ISO 27035 y un Dashboard de Salud Operacional con gráficos analíticos y cálculo en tiempo real de MTTR y horas de downtime.</w:t>
+        <w:t>La problemática abordada responde a una ineficiencia logística severa y verificable en la administración de espacios de alta demanda institucional: la dispersión de reservas en planillas de cálculo aisladas, el solapamiento de horarios, la falta de registro del tiempo efectivo de dedicación del personal técnico audiovisual (pérdida de hasta 60 minutos en esperas pasivas por evento), la inasistencia docente no avisada (No-Shows) y la desarticulación operativa con cuadrillas auxiliares de Aseo y Guardia.</w:t>
       </w:r>
     </w:p>
     <w:p>
@@ -151,7 +155,7 @@
           <w:color w:val="1E293B"/>
           <w:sz w:val="20"/>
         </w:rPr>
-        <w:t>El prototipo superó con éxito la compilación de producción con cero errores y quince casos de prueba bajo el estándar ISO/IEC 25010.</w:t>
+        <w:t>Durante la Fase 2 se construyó una arquitectura Fullstack moderna desacoplada en cinco portales especializados por perfil (/login, /docente, /tecnico, /encargado y /admin), desarrollada bajo Next.js 15 (App Router, React 19) con Server Actions seguras y tipado estricto en TypeScript 5.7. Se incorporó trazabilidad QR con cámara inteligente y auto-apagado de hardware, cómputo automatizado de horas dedicadas de soporte TI (Delta T), Gestor de Cuentas RBAC con doble verificación de 4 ojos, Bitácora Forense Individual por usuario, motor RPA de 4 bots autónomos, Plan de Respuesta a Incidentes (IRP bajo NIST SP 800-61), Dashboard de Salud con MTTR y dualidad de persistencia en SQLite y Neon Cloud PostgreSQL. El prototipo superó la compilación de producción (next build) con 0 errores y 15 casos de prueba bajo ISO/IEC 25010.</w:t>
       </w:r>
     </w:p>
     <w:p>
@@ -163,9 +167,9 @@
           <w:rFonts w:ascii="Calibri" w:hAnsi="Calibri"/>
           <w:b/>
           <w:color w:val="1E3A8A"/>
-          <w:sz w:val="26"/>
+          <w:sz w:val="28"/>
         </w:rPr>
-        <w:t>2. PROPUESTA DE AJUSTES AL PROYECTO APT (INDICADOR 1 - 10%)</w:t>
+        <w:t>PARTE I: METADATOS, ANTECEDENTES Y ESTADO DE TRANSICIÓN (FASE 1 A FASE 2)</w:t>
       </w:r>
     </w:p>
     <w:p>
@@ -177,9 +181,9 @@
           <w:rFonts w:ascii="Calibri" w:hAnsi="Calibri"/>
           <w:b/>
           <w:color w:val="0F172A"/>
-          <w:sz w:val="22"/>
+          <w:sz w:val="23"/>
         </w:rPr>
-        <w:t>2.1. Dificultades Detectadas y Acciones Correctivas</w:t>
+        <w:t>1.1. Antecedentes del Postulante e Independencia Institucional</w:t>
       </w:r>
     </w:p>
     <w:p>
@@ -194,7 +198,21 @@
           <w:color w:val="1E293B"/>
           <w:sz w:val="20"/>
         </w:rPr>
-        <w:t>• Riesgo Humano en la Reprogramación de Horarios: Durante los ensayos operativos, se detectó que permitir la edición directa de fechas y horas en la agenda ejecutiva podía generar desajustes involuntarios que afectaban la coordinación previa con docentes y cuadrillas. Se diseñó un modal de seguridad con caja de advertencia en color ámbar y una casilla de verificación obligatoria ('Sí, confirmo bajo mi rol de Administrador que estoy seguro de realizar este cambio de horario'). El botón de guardado permanece deshabilitado hasta marcar la casilla, y la acción queda registrada inmutablemente en la bitácora (HORARIO_MODIFICADO_ADMIN).</w:t>
+        <w:t>El proyecto es desarrollado por el estudiante Benjamín Abraham Navarrete Hernández (RUT 21.252.605-3) en Duoc UC Sede La Florida. Se concibe como una solución genérica, parametrizable y transferible (White-Label) aplicable a cualquier institución o recinto de alta concurrencia.</w:t>
+      </w:r>
+    </w:p>
+    <w:p>
+      <w:pPr>
+        <w:spacing w:before="200" w:after="60"/>
+      </w:pPr>
+      <w:r>
+        <w:rPr>
+          <w:rFonts w:ascii="Calibri" w:hAnsi="Calibri"/>
+          <w:b/>
+          <w:color w:val="0F172A"/>
+          <w:sz w:val="23"/>
+        </w:rPr>
+        <w:t>1.2. Alcance del Producto Mínimo Viable (MVP) Operativo</w:t>
       </w:r>
     </w:p>
     <w:p>
@@ -209,7 +227,21 @@
           <w:color w:val="1E293B"/>
           <w:sz w:val="20"/>
         </w:rPr>
-        <w:t>• Carencia de Visibilidad sobre el Estado Técnico de los Implementos: Cuando un micrófono o proyector se reportaba defectuoso, el sistema primitivo sólo cambiaba el stock pero no ofrecía analítica de horas inoperativas ni dejaba constancia técnica de la reparación. Se construyó el componente MaintenanceDashboard.tsx, que incorpora gráficos analíticos de barras y radiales, telemetría de MTTR (Mean Time to Repair), downtime acumulado y un formulario de resolución técnica obligatoria.</w:t>
+        <w:t>El MVP construido integra 5 portales: Portal de Acceso Unificado (/login), Portal Docente (/docente) con solicitud y Pase QR 2D real scannable, Portal Soporte TI (/tecnico) con escáner de cámara inteligente, auto-cierre de hardware, cómputo Delta T de horas TI y reporte de incidencias en sala, Portal Encargada (/encargado) con aprobación/rechazo fundado, y Portal Administrador General (/admin) con centro de mando de 6 submódulos.</w:t>
+      </w:r>
+    </w:p>
+    <w:p>
+      <w:pPr>
+        <w:spacing w:before="200" w:after="60"/>
+      </w:pPr>
+      <w:r>
+        <w:rPr>
+          <w:rFonts w:ascii="Calibri" w:hAnsi="Calibri"/>
+          <w:b/>
+          <w:color w:val="0F172A"/>
+          <w:sz w:val="23"/>
+        </w:rPr>
+        <w:t>1.3. Matriz Comparativa de Ingeniería: Fase 1 vs. Fase 2</w:t>
       </w:r>
     </w:p>
     <w:p>
@@ -224,7 +256,7 @@
           <w:color w:val="1E293B"/>
           <w:sz w:val="20"/>
         </w:rPr>
-        <w:t>• Sobrecarga Cognitiva y Accesibilidad: Una interfaz unificada con demasiados controles simultáneos provocaba fatiga visual y entorpecía el trabajo de usuarios mayores o técnicos en terreno. Se desacoplaron estrictamente las vistas por rol (/docente, /tecnico, /encargado, /admin), con paleta de alto contraste (WCAG 2.1 AA) y botones táctiles mayores a 52px en smartphone.</w:t>
+        <w:t>• Enfoque: De especificaciones teóricas (Fase 1) a software 100% programado y operativo (Fase 2).</w:t>
       </w:r>
     </w:p>
     <w:p>
@@ -239,21 +271,7 @@
           <w:color w:val="1E293B"/>
           <w:sz w:val="20"/>
         </w:rPr>
-        <w:t>• Riesgo de Bloqueo por Pérdida de Conexión a Internet: Si el sistema dependiera exclusivamente de la nube, una caída de fibra óptica en la sede paralizaría el acceso a los auditorios. Se implementó la dualidad de persistencia: Neon Cloud PostgreSQL para producción y SQLite local para contingencia autónoma offline en terreno.</w:t>
-      </w:r>
-    </w:p>
-    <w:p>
-      <w:pPr>
-        <w:spacing w:before="200" w:after="60"/>
-      </w:pPr>
-      <w:r>
-        <w:rPr>
-          <w:rFonts w:ascii="Calibri" w:hAnsi="Calibri"/>
-          <w:b/>
-          <w:color w:val="0F172A"/>
-          <w:sz w:val="22"/>
-        </w:rPr>
-        <w:t>2.2. Factores Facilitadores del Desarrollo</w:t>
+        <w:t>• Requerimientos: 25 RF y 10 RS implementados en Server Actions y componentes React 19.</w:t>
       </w:r>
     </w:p>
     <w:p>
@@ -268,7 +286,7 @@
           <w:color w:val="1E293B"/>
           <w:sz w:val="20"/>
         </w:rPr>
-        <w:t>• Arquitectura de Next.js 15 App Router y Server Actions: Permitió ejecutar la lógica de negocio y mutaciones transaccionales directamente en el backend sin requerir APIs REST vulnerables a intercepción.</w:t>
+        <w:t>• Persistencia: De bosquejos a 10 entidades en Prisma ORM con integridad referencial en SQLite y Neon PostgreSQL.</w:t>
       </w:r>
     </w:p>
     <w:p>
@@ -283,7 +301,7 @@
           <w:color w:val="1E293B"/>
           <w:sz w:val="20"/>
         </w:rPr>
-        <w:t>• Tipado Estricto con TypeScript 5.7 y Prisma ORM v6: Aseguró la coherencia de datos de extremo a extremo, eliminando errores de tipo en tiempo de compilación y blindando la base de datos contra inyecciones SQL mediante consultas preparadas.</w:t>
+        <w:t>• Interfaces: De mockups Figma a 5 portales web operativos en Tailwind CSS bajo normas WCAG 2.1 AA.</w:t>
       </w:r>
     </w:p>
     <w:p>
@@ -298,7 +316,21 @@
           <w:color w:val="1E293B"/>
           <w:sz w:val="20"/>
         </w:rPr>
-        <w:t>• Diseño Accesible con Tailwind CSS: Facilitó la aplicación sistemática de tokens de diseño WCAG 2.1 AA con contraste superior a 4.5:1.</w:t>
+        <w:t>• Compilación: Build de producción exitoso con 0 errores y rutas prerenderizadas estáticamente.</w:t>
+      </w:r>
+    </w:p>
+    <w:p>
+      <w:pPr>
+        <w:spacing w:before="280" w:after="80"/>
+      </w:pPr>
+      <w:r>
+        <w:rPr>
+          <w:rFonts w:ascii="Calibri" w:hAnsi="Calibri"/>
+          <w:b/>
+          <w:color w:val="1E3A8A"/>
+          <w:sz w:val="28"/>
+        </w:rPr>
+        <w:t>PARTE II: PROPUESTA DE AJUSTES Y RETROALIMENTACIÓN DOCENTE (INDICADOR 1 - 10%)</w:t>
       </w:r>
     </w:p>
     <w:p>
@@ -310,9 +342,9 @@
           <w:rFonts w:ascii="Calibri" w:hAnsi="Calibri"/>
           <w:b/>
           <w:color w:val="0F172A"/>
-          <w:sz w:val="22"/>
+          <w:sz w:val="23"/>
         </w:rPr>
-        <w:t>2.3. Incorporación de la Retroalimentación Docente</w:t>
+        <w:t>2.1. Dificultades Técnicas y Acciones Correctivas</w:t>
       </w:r>
     </w:p>
     <w:p>
@@ -327,21 +359,7 @@
           <w:color w:val="1E293B"/>
           <w:sz w:val="20"/>
         </w:rPr>
-        <w:t>Se atendieron rigurosamente las observaciones formuladas por el docente guía Diego Garcés: se eliminaron interfaces cosméticas de ciberseguridad a favor de seguridad embebida en el backend (bcrypt, cookies HttpOnly, Zod, bitácora forense), se incorporó el control de asistencia para penalizar el absentismo docente (No-Show), se diseñó el sistema de notificación a cuadrillas de servicio (Aseo y Guardia), y se formalizó el Plan de Respuesta a Incidentes (IRP) y la automatización robótica (RPA).</w:t>
-      </w:r>
-    </w:p>
-    <w:p>
-      <w:pPr>
-        <w:spacing w:before="280" w:after="80"/>
-      </w:pPr>
-      <w:r>
-        <w:rPr>
-          <w:rFonts w:ascii="Calibri" w:hAnsi="Calibri"/>
-          <w:b/>
-          <w:color w:val="1E3A8A"/>
-          <w:sz w:val="26"/>
-        </w:rPr>
-        <w:t>3. METODOLOGÍA DE TRABAJO DISCIPLINAR (INDICADOR 2 - 10%)</w:t>
+        <w:t>1. Riesgo Humano en Reprogramación: Se creó un modal interactivo con advertencia ámbar y una casilla obligatoria de confirmación de seguridad inhabilitante ('Sí, confirmo bajo mi rol de Administrador que estoy seguro de realizar este cambio de horario') firmada en la auditoría como HORARIO_MODIFICADO_ADMIN.</w:t>
       </w:r>
     </w:p>
     <w:p>
@@ -356,21 +374,7 @@
           <w:color w:val="1E293B"/>
           <w:sz w:val="20"/>
         </w:rPr>
-        <w:t>El desarrollo se organizó bajo un marco ágil Scrum adaptado en cinco iteraciones (Sprints de 2 semanas) con control de versiones bajo GitFlow y evaluación continua de calidad del software bajo el estándar ISO/IEC 25010 en sus dimensiones de adecuación funcional, eficiencia de desempeño (&lt; 120ms), usabilidad accesible (WCAG 2.1 AA), fiabilidad transaccional (ACID) y seguridad defensiva.</w:t>
-      </w:r>
-    </w:p>
-    <w:p>
-      <w:pPr>
-        <w:spacing w:before="280" w:after="80"/>
-      </w:pPr>
-      <w:r>
-        <w:rPr>
-          <w:rFonts w:ascii="Calibri" w:hAnsi="Calibri"/>
-          <w:b/>
-          <w:color w:val="1E3A8A"/>
-          <w:sz w:val="26"/>
-        </w:rPr>
-        <w:t>4. EVIDENCIAS DE AVANCE EN DOCUMENTACIÓN, PROGRAMACIÓN Y DATOS (INDICADOR 3 - 25%)</w:t>
+        <w:t>2. Falta de Visibilidad de Hardware Averiado: Se construyó el componente MaintenanceDashboard.tsx con cálculo de MTTR, downtime acumulado, gráficos analíticos y constancia técnica obligatoria para reactivar implementos.</w:t>
       </w:r>
     </w:p>
     <w:p>
@@ -385,7 +389,7 @@
           <w:color w:val="1E293B"/>
           <w:sz w:val="20"/>
         </w:rPr>
-        <w:t>• Arquitectura de Software: Next.js 15, React 19, TypeScript y Server Actions centralizadas en src/lib/actions.ts con validación Zod.</w:t>
+        <w:t>3. Fatiga Visual y Sobrecarga Cognitiva: Se desacoplaron totalmente las vistas por rol con paleta luminosa de alto contraste (WCAG 2.1 AA) y botones táctiles &gt; 52px en smartphones.</w:t>
       </w:r>
     </w:p>
     <w:p>
@@ -400,7 +404,21 @@
           <w:color w:val="1E293B"/>
           <w:sz w:val="20"/>
         </w:rPr>
-        <w:t>• 5 Portales Web Operativos: Acceso unificado (/login), Portal Docente (/docente), Portal Técnico Móvil (/tecnico), Portal Encargada (/encargado) y Portal Administrador General (/admin).</w:t>
+        <w:t>4. Tolerancia ante Caídas de Internet: Se implementó la persistencia dual (SQLite local offline para contingencia en el campus y Neon Cloud PostgreSQL para disponibilidad global).</w:t>
+      </w:r>
+    </w:p>
+    <w:p>
+      <w:pPr>
+        <w:spacing w:before="200" w:after="60"/>
+      </w:pPr>
+      <w:r>
+        <w:rPr>
+          <w:rFonts w:ascii="Calibri" w:hAnsi="Calibri"/>
+          <w:b/>
+          <w:color w:val="0F172A"/>
+          <w:sz w:val="23"/>
+        </w:rPr>
+        <w:t>2.2. Incorporación de la Retroalimentación del Docente Guía</w:t>
       </w:r>
     </w:p>
     <w:p>
@@ -415,7 +433,21 @@
           <w:color w:val="1E293B"/>
           <w:sz w:val="20"/>
         </w:rPr>
-        <w:t>• Base de Datos Relacional de 10 Entidades en Prisma ORM: User, Auditorio, Implemento, Reserva, ImplementoPrestado, RegistroHorasTI, EncuestaSatisfaccion, SuscripcionArea, RegistroAuditoria y NovedadMantenimiento.</w:t>
+        <w:t>Se atendieron estrictamente todas las observaciones del profesor Diego Garcés: reemplazo de ciberseguridad cosmética por seguridad defensiva real en el backend (bcrypt salt 10, Zod, cookies HttpOnly, bitácora forense), penalización automática de No-Shows sobre el priorityScore del docente, integración de cuadrillas de Aseo y Guardia, y formalización de los módulos RPA e IRP.</w:t>
+      </w:r>
+    </w:p>
+    <w:p>
+      <w:pPr>
+        <w:spacing w:before="280" w:after="80"/>
+      </w:pPr>
+      <w:r>
+        <w:rPr>
+          <w:rFonts w:ascii="Calibri" w:hAnsi="Calibri"/>
+          <w:b/>
+          <w:color w:val="1E3A8A"/>
+          <w:sz w:val="28"/>
+        </w:rPr>
+        <w:t>PARTE III: METODOLOGÍA DISCIPLINAR Y GESTIÓN DE CONFIGURACIÓN (INDICADOR 2 - 10%)</w:t>
       </w:r>
     </w:p>
     <w:p>
@@ -430,7 +462,7 @@
           <w:color w:val="1E293B"/>
           <w:sz w:val="20"/>
         </w:rPr>
-        <w:t>• Módulos Críticos Avanzados: Gestor de Cuentas RBAC con Doble Verificación y Bitácora Forense Individual, Motor RPA con 4 Bots Autónomos de Contingencia, Plan IRP bajo NIST SP 800-61 / ISO 27035, Pase QR 2D real scannable y verificación de equipos por TI.</w:t>
+        <w:t>• Marco Scrum Adaptado: Desarrollo organizado en 5 Sprints de 2 semanas de duración (Sprint 1: Modelado Prisma y Auth RBAC; Sprint 2: Portal Docente y Generación QR 2D; Sprint 3: Portal Técnico, Cámara y Delta T; Sprint 4: Portal Encargada, Admin y Cuadrillas; Sprint 5: Gestor RBAC, RPA, IRP y Build Prod).</w:t>
       </w:r>
     </w:p>
     <w:p>
@@ -445,21 +477,7 @@
           <w:color w:val="1E293B"/>
           <w:sz w:val="20"/>
         </w:rPr>
-        <w:t>• Compilación de Producción Verificada: El comando `npm run build` finaliza con 100% de éxito y cero errores (0 errors), prerenderizando todas las rutas estáticamente.</w:t>
-      </w:r>
-    </w:p>
-    <w:p>
-      <w:pPr>
-        <w:spacing w:before="280" w:after="80"/>
-      </w:pPr>
-      <w:r>
-        <w:rPr>
-          <w:rFonts w:ascii="Calibri" w:hAnsi="Calibri"/>
-          <w:b/>
-          <w:color w:val="1E3A8A"/>
-          <w:sz w:val="26"/>
-        </w:rPr>
-        <w:t>5. USO DEL LENGUAJE TÉCNICO Y NORMAS FORMALES (INDICADORES 4 Y 5)</w:t>
+        <w:t>• GitFlow: Repositorio público en GitHub con rama main sincronizada y commits semánticos trazables.</w:t>
       </w:r>
     </w:p>
     <w:p>
@@ -474,7 +492,7 @@
           <w:color w:val="1E293B"/>
           <w:sz w:val="20"/>
         </w:rPr>
-        <w:t>Se utilizó un lenguaje técnico riguroso propio de la disciplina (Principio de Menor Privilegio PoLP, Criterios WCAG 2.1 AA, MTTR, Delta T, RBAC, ACID, IRP NIST SP 800-61, RPA), redacción profesional y referencias bibliográficas normalizadas según APA 7ma edición.</w:t>
+        <w:t>• Calidad ISO/IEC 25010: Evaluación de adecuación funcional (15 casos de prueba), eficiencia de desempeño (&lt; 120ms), usabilidad accesible (WCAG 2.1 AA), fiabilidad transaccional (ACID) y seguridad defensiva.</w:t>
       </w:r>
     </w:p>
     <w:p>
@@ -486,9 +504,23 @@
           <w:rFonts w:ascii="Calibri" w:hAnsi="Calibri"/>
           <w:b/>
           <w:color w:val="1E3A8A"/>
-          <w:sz w:val="26"/>
+          <w:sz w:val="28"/>
         </w:rPr>
-        <w:t>6. GESTIÓN EN GIT Y APORTE INDIVIDUAL (INDICADORES 6 Y 7)</w:t>
+        <w:t>PARTE IV: EVIDENCIAS DE DESARROLLO, ARQUITECTURA Y DATOS (INDICADOR 3 - 25%)</w:t>
+      </w:r>
+    </w:p>
+    <w:p>
+      <w:pPr>
+        <w:spacing w:before="200" w:after="60"/>
+      </w:pPr>
+      <w:r>
+        <w:rPr>
+          <w:rFonts w:ascii="Calibri" w:hAnsi="Calibri"/>
+          <w:b/>
+          <w:color w:val="0F172A"/>
+          <w:sz w:val="23"/>
+        </w:rPr>
+        <w:t>4.1. Arquitectura de Software y Portales Especializados</w:t>
       </w:r>
     </w:p>
     <w:p>
@@ -503,21 +535,21 @@
           <w:color w:val="1E293B"/>
           <w:sz w:val="20"/>
         </w:rPr>
-        <w:t>El repositorio oficial https://github.com/IMANDOI/sistema-gestion-auditorios-capstone consolida todas las evidencias de código y documentación. El estudiante Benjamín Navarrete asumió el 100% del liderazgo y desarrollo del proyecto como Super Administrador y Arquitecto Fullstack.</w:t>
+        <w:t>Construcción Fullstack con Next.js 15 App Router, React 19, TypeScript estricto y Server Actions en src/lib/actions.ts con sanitización Zod.</w:t>
       </w:r>
     </w:p>
     <w:p>
       <w:pPr>
-        <w:spacing w:before="280" w:after="80"/>
+        <w:spacing w:before="200" w:after="60"/>
       </w:pPr>
       <w:r>
         <w:rPr>
           <w:rFonts w:ascii="Calibri" w:hAnsi="Calibri"/>
           <w:b/>
-          <w:color w:val="1E3A8A"/>
-          <w:sz w:val="26"/>
+          <w:color w:val="0F172A"/>
+          <w:sz w:val="23"/>
         </w:rPr>
-        <w:t>7. CONCLUSIONES INDIVIDUALES DEL DESARROLLO (FASE 2)</w:t>
+        <w:t>4.2. Persistencia Relacional de 10 Entidades en Prisma ORM</w:t>
       </w:r>
     </w:p>
     <w:p>
@@ -532,7 +564,21 @@
           <w:color w:val="1E293B"/>
           <w:sz w:val="20"/>
         </w:rPr>
-        <w:t>Durante la Fase 2 del Proyecto Capstone, el desarrollo e implementación arquitectónica del Sistema Autónomo de Gestión Operativa de Auditorios para Duoc UC alcanzó plena operatividad funcional. Mediante la adopción sistemática de Next.js 15 App Router, React 19 y Prisma ORM, el proyecto realizó una transición exitosa desde las especificaciones teóricas de la Fase 1 hacia un Producto Mínimo Viable de grado industrial listo para producción.</w:t>
+        <w:t>Esquema relacional en 3FN que modela: User (identidades y roles RBAC), Auditorio (capacidad y estado), Implemento (inventario audiovisual con stock), Reserva (solicitudes y token QR), ImplementoPrestado (relación de hardware asignado), RegistroHorasTI (horas Delta T), EncuestaSatisfaccion (NPS), SuscripcionArea (cuadrillas de Aseo, Guardia y TI), RegistroAuditoria (bitácora forense inmutable) y NovedadMantenimiento (casos de taller con severidad y diagnóstico).</w:t>
+      </w:r>
+    </w:p>
+    <w:p>
+      <w:pPr>
+        <w:spacing w:before="200" w:after="60"/>
+      </w:pPr>
+      <w:r>
+        <w:rPr>
+          <w:rFonts w:ascii="Calibri" w:hAnsi="Calibri"/>
+          <w:b/>
+          <w:color w:val="0F172A"/>
+          <w:sz w:val="23"/>
+        </w:rPr>
+        <w:t>4.3. Subsistema de Trazabilidad QR y Cómputo de Horas TI</w:t>
       </w:r>
     </w:p>
     <w:p>
@@ -547,7 +593,21 @@
           <w:color w:val="1E293B"/>
           <w:sz w:val="20"/>
         </w:rPr>
-        <w:t>La separación modular en portales desacoplados por perfil (/docente, /tecnico, /encargado, /admin) optimizó sustancialmente la experiencia de usuario y la seguridad operativa, haciendo cumplir de forma estricta el Principio de Menor Privilegio (PoLP) y las pautas de accesibilidad universal WCAG 2.1 nivel AA. El mecanismo de validación de pases QR redujo el procedimiento de recepción técnica en terreno a menos de 30 segundos, calculando automáticamente las horas de soporte dedicadas (Delta T) y erradicando el tiempo muerto histórico de espera pasiva del personal audiovisual.</w:t>
+        <w:t>Pase QR con matriz bidimensional real (QRCodeDisplay.tsx), escáner de cámara inteligente con aceleración de hardware y auto-apagado de video (CameraQRScanner.tsx), y cómputo matemático de horas dedicadas Delta T = T_checkout - T_checkin persistidas en el servidor.</w:t>
+      </w:r>
+    </w:p>
+    <w:p>
+      <w:pPr>
+        <w:spacing w:before="200" w:after="60"/>
+      </w:pPr>
+      <w:r>
+        <w:rPr>
+          <w:rFonts w:ascii="Calibri" w:hAnsi="Calibri"/>
+          <w:b/>
+          <w:color w:val="0F172A"/>
+          <w:sz w:val="23"/>
+        </w:rPr>
+        <w:t>4.4. Módulos Avanzados de Resiliencia: Gestor RBAC, RPA e IRP</w:t>
       </w:r>
     </w:p>
     <w:p>
@@ -562,7 +622,7 @@
           <w:color w:val="1E293B"/>
           <w:sz w:val="20"/>
         </w:rPr>
-        <w:t>Asimismo, la integración del Dashboard de Salud y Mantenimiento, el motor RPA de 4 bots autónomos, el Gestor de Cuentas RBAC con doble verificación y el Plan de Respuesta a Incidentes (IRP) bajo la norma NIST SP 800-61 proporcionan a la institución una herramienta integral de alta resiliencia y trazabilidad forense.</w:t>
+        <w:t>• Gestor de Cuentas RBAC con Doble Verificación: Principio de 4 ojos para creación, otorgamiento de rol gestor y eliminación segura de cuentas, con Bitácora Forense Individual por usuario.</w:t>
       </w:r>
     </w:p>
     <w:p>
@@ -577,21 +637,7 @@
           <w:color w:val="1E293B"/>
           <w:sz w:val="20"/>
         </w:rPr>
-        <w:t>En conclusión, la Fase 2 cumplió con el 100% de los hitos y requerimientos planificados con cero errores de compilación, entregando una solución robusta, escalable y segura, completamente preparada para la fase final de pruebas masivas y defensa de título.</w:t>
-      </w:r>
-    </w:p>
-    <w:p>
-      <w:pPr>
-        <w:spacing w:before="280" w:after="80"/>
-      </w:pPr>
-      <w:r>
-        <w:rPr>
-          <w:rFonts w:ascii="Calibri" w:hAnsi="Calibri"/>
-          <w:b/>
-          <w:color w:val="1E3A8A"/>
-          <w:sz w:val="26"/>
-        </w:rPr>
-        <w:t>8. REFLEXIÓN PROFESIONAL INDIVIDUAL</w:t>
+        <w:t>• Motor RPA (4 Bots Autónomos): Watchdog Sentry Bot (salud y latencia), Auto-Cleaner Bot (purga de tokens expirados), Audit Compliance Bot (integridad criptográfica) y Data Sync Reconciler Bot (sincronización local-nube).</w:t>
       </w:r>
     </w:p>
     <w:p>
@@ -606,7 +652,7 @@
           <w:color w:val="1E293B"/>
           <w:sz w:val="20"/>
         </w:rPr>
-        <w:t>Al reflexionar sobre el proceso de ingeniería ejecutado a lo largo de esta segunda etapa, considero que el desarrollo de este proyecto constituyó un punto de inflexión decisivo en mi formación como profesional de la informática y las telecomunicaciones. Construir un sistema de software con estándares empresariales demandó no solo aplicar competencias avanzadas de programación y modelamiento de bases de datos, sino también ejercer una rigurosa disciplina arquitectónica, visión de ciberseguridad y empatía en el diseño centrado en las personas.</w:t>
+        <w:t>• Plan de Respuesta a Incidentes (IRP): Triaje forense alineado con NIST SP 800-61 / ISO 27035 con clasificación por severidad (SEV-1 a SEV-4) y sellado inmutable.</w:t>
       </w:r>
     </w:p>
     <w:p>
@@ -621,7 +667,21 @@
           <w:color w:val="1E293B"/>
           <w:sz w:val="20"/>
         </w:rPr>
-        <w:t>Uno de los aprendizajes más significativos fue comprender el valor de la seguridad defensiva embebida sobre las funcionalidades meramente cosméticas. Reemplazar una pantalla superficial de monitoreo por salvaguardas estructurales en el núcleo de la aplicación —como el hasheo criptográfico con salt en bcrypt, la protección CSRF en Server Actions y la bitácora forense inmutable vinculada a cada usuario— demostró que la verdadera ingeniería de software prioriza la resiliencia y la integridad de la información sobre las apariencias.</w:t>
+        <w:t>• Dashboard de Mantenimiento: Telemetría de MTTR, downtime acumulado y gráficos analíticos de barras y radiales.</w:t>
+      </w:r>
+    </w:p>
+    <w:p>
+      <w:pPr>
+        <w:spacing w:before="200" w:after="60"/>
+      </w:pPr>
+      <w:r>
+        <w:rPr>
+          <w:rFonts w:ascii="Calibri" w:hAnsi="Calibri"/>
+          <w:b/>
+          <w:color w:val="0F172A"/>
+          <w:sz w:val="23"/>
+        </w:rPr>
+        <w:t>4.5. Compilación de Producción Verificada</w:t>
       </w:r>
     </w:p>
     <w:p>
@@ -636,7 +696,21 @@
           <w:color w:val="1E293B"/>
           <w:sz w:val="20"/>
         </w:rPr>
-        <w:t>De igual manera, abordar los desafíos reales de la logística institucional en el campus me enseñó a concebir el software desde las necesidades concretas de cada usuario final. Desarrollar interfaces de alto contraste para docentes y flujos ágiles pensados para operar con una sola mano en smartphones para los técnicos en terreno reforzó mi convicción sobre la importancia ética de la accesibilidad digital.</w:t>
+        <w:t>El comando `npm run build` ejecutó exitosamente con 0 errores, prerenderizando estáticamente todas las rutas de la aplicación.</w:t>
+      </w:r>
+    </w:p>
+    <w:p>
+      <w:pPr>
+        <w:spacing w:before="280" w:after="80"/>
+      </w:pPr>
+      <w:r>
+        <w:rPr>
+          <w:rFonts w:ascii="Calibri" w:hAnsi="Calibri"/>
+          <w:b/>
+          <w:color w:val="1E3A8A"/>
+          <w:sz w:val="28"/>
+        </w:rPr>
+        <w:t>PARTE V: ASPECTOS FORMALES, REPOSITORIO GIT Y APORTE INDIVIDUAL (INDICADORES 4, 5, 6 Y 7 - 45%)</w:t>
       </w:r>
     </w:p>
     <w:p>
@@ -651,7 +725,376 @@
           <w:color w:val="1E293B"/>
           <w:sz w:val="20"/>
         </w:rPr>
-        <w:t>Con el sistema plenamente operativo tanto en el entorno local como en la nube mediante Vercel y Neon PostgreSQL, afronto la etapa final del proyecto con absoluta confianza en mis capacidades técnicas, criterio ingenieril y preparación para incorporarme con éxito al ejercicio profesional de la industria tecnológica.</w:t>
+        <w:t>• Lenguaje Técnico y Glosario (Indicador 4): Uso riguroso de conceptos disciplinares (PoLP, Server Actions, ACID, MTTR, Delta T, RBAC, IRP NIST SP 800-61, RPA, WCAG 2.1 AA).</w:t>
+      </w:r>
+    </w:p>
+    <w:p>
+      <w:pPr>
+        <w:spacing w:after="80" w:line="276" w:lineRule="auto"/>
+      </w:pPr>
+      <w:r>
+        <w:rPr>
+          <w:rFonts w:ascii="Calibri" w:hAnsi="Calibri"/>
+          <w:b w:val="0"/>
+          <w:i w:val="0"/>
+          <w:color w:val="1E293B"/>
+          <w:sz w:val="20"/>
+        </w:rPr>
+        <w:t>• Normas Formales y APA 7 (Indicador 5): Redacción formal en español, citas y referencias bibliográficas según APA 7ma edición.</w:t>
+      </w:r>
+    </w:p>
+    <w:p>
+      <w:pPr>
+        <w:spacing w:after="80" w:line="276" w:lineRule="auto"/>
+      </w:pPr>
+      <w:r>
+        <w:rPr>
+          <w:rFonts w:ascii="Calibri" w:hAnsi="Calibri"/>
+          <w:b w:val="0"/>
+          <w:i w:val="0"/>
+          <w:color w:val="1E293B"/>
+          <w:sz w:val="20"/>
+        </w:rPr>
+        <w:t>• Repositorio Git (Indicador 6 - 20%): Repositorio público https://github.com/IMANDOI/sistema-gestion-auditorios-capstone con estructura limpia y organizada.</w:t>
+      </w:r>
+    </w:p>
+    <w:p>
+      <w:pPr>
+        <w:spacing w:after="80" w:line="276" w:lineRule="auto"/>
+      </w:pPr>
+      <w:r>
+        <w:rPr>
+          <w:rFonts w:ascii="Calibri" w:hAnsi="Calibri"/>
+          <w:b w:val="0"/>
+          <w:i w:val="0"/>
+          <w:color w:val="1E293B"/>
+          <w:sz w:val="20"/>
+        </w:rPr>
+        <w:t>• Aporte Individual (Indicador 7 - 15%): Benjamín Abraham Navarrete Hernández asumió el 100% del liderazgo técnico, diseño arquitectónico, programación del código fuente y redacción documental.</w:t>
+      </w:r>
+    </w:p>
+    <w:p>
+      <w:pPr>
+        <w:spacing w:before="280" w:after="80"/>
+      </w:pPr>
+      <w:r>
+        <w:rPr>
+          <w:rFonts w:ascii="Calibri" w:hAnsi="Calibri"/>
+          <w:b/>
+          <w:color w:val="1E3A8A"/>
+          <w:sz w:val="28"/>
+        </w:rPr>
+        <w:t>PARTE VI: DOMINIO TÉCNICO, COMPETENCIAS DE EGRESO Y CONCLUSIONES (INDICADOR 8 - 10%)</w:t>
+      </w:r>
+    </w:p>
+    <w:p>
+      <w:pPr>
+        <w:spacing w:before="200" w:after="60"/>
+      </w:pPr>
+      <w:r>
+        <w:rPr>
+          <w:rFonts w:ascii="Calibri" w:hAnsi="Calibri"/>
+          <w:b/>
+          <w:color w:val="0F172A"/>
+          <w:sz w:val="23"/>
+        </w:rPr>
+        <w:t>6.1. Demostración de Dominio Técnico y Defensa Oral (Indicador 8)</w:t>
+      </w:r>
+    </w:p>
+    <w:p>
+      <w:pPr>
+        <w:spacing w:after="80" w:line="276" w:lineRule="auto"/>
+      </w:pPr>
+      <w:r>
+        <w:rPr>
+          <w:rFonts w:ascii="Calibri" w:hAnsi="Calibri"/>
+          <w:b w:val="0"/>
+          <w:i w:val="0"/>
+          <w:color w:val="1E293B"/>
+          <w:sz w:val="20"/>
+        </w:rPr>
+        <w:t>Dominio conceptual fluido para responder ante la comisión: justificación del desacoplamiento por roles, defensa de la seguridad defensiva embebida sobre vistas cosméticas y explicación de la dualidad de base de datos para operar en modo contingencia.</w:t>
+      </w:r>
+    </w:p>
+    <w:p>
+      <w:pPr>
+        <w:spacing w:before="200" w:after="60"/>
+      </w:pPr>
+      <w:r>
+        <w:rPr>
+          <w:rFonts w:ascii="Calibri" w:hAnsi="Calibri"/>
+          <w:b/>
+          <w:color w:val="0F172A"/>
+          <w:sz w:val="23"/>
+        </w:rPr>
+        <w:t>6.2. Verificación de las 4 Competencias del Perfil de Egreso</w:t>
+      </w:r>
+    </w:p>
+    <w:p>
+      <w:pPr>
+        <w:spacing w:after="80" w:line="276" w:lineRule="auto"/>
+      </w:pPr>
+      <w:r>
+        <w:rPr>
+          <w:rFonts w:ascii="Calibri" w:hAnsi="Calibri"/>
+          <w:b w:val="0"/>
+          <w:i w:val="0"/>
+          <w:color w:val="1E293B"/>
+          <w:sz w:val="20"/>
+        </w:rPr>
+        <w:t>• Competencia 1 (QA): 15 casos de prueba ejecutados bajo ISO/IEC 25010 y mejoras post-ensayo implementadas.</w:t>
+      </w:r>
+    </w:p>
+    <w:p>
+      <w:pPr>
+        <w:spacing w:after="80" w:line="276" w:lineRule="auto"/>
+      </w:pPr>
+      <w:r>
+        <w:rPr>
+          <w:rFonts w:ascii="Calibri" w:hAnsi="Calibri"/>
+          <w:b w:val="0"/>
+          <w:i w:val="0"/>
+          <w:color w:val="1E293B"/>
+          <w:sz w:val="20"/>
+        </w:rPr>
+        <w:t>• Competencia 2 (Gestión): Planificación en 5 Sprints ágiles y control de cronograma en 18 semanas.</w:t>
+      </w:r>
+    </w:p>
+    <w:p>
+      <w:pPr>
+        <w:spacing w:after="80" w:line="276" w:lineRule="auto"/>
+      </w:pPr>
+      <w:r>
+        <w:rPr>
+          <w:rFonts w:ascii="Calibri" w:hAnsi="Calibri"/>
+          <w:b w:val="0"/>
+          <w:i w:val="0"/>
+          <w:color w:val="1E293B"/>
+          <w:sz w:val="20"/>
+        </w:rPr>
+        <w:t>• Competencia 3 (Datos): 10 entidades en Prisma ORM en 3FN compatibles con SQLite y Neon PostgreSQL.</w:t>
+      </w:r>
+    </w:p>
+    <w:p>
+      <w:pPr>
+        <w:spacing w:after="80" w:line="276" w:lineRule="auto"/>
+      </w:pPr>
+      <w:r>
+        <w:rPr>
+          <w:rFonts w:ascii="Calibri" w:hAnsi="Calibri"/>
+          <w:b w:val="0"/>
+          <w:i w:val="0"/>
+          <w:color w:val="1E293B"/>
+          <w:sz w:val="20"/>
+        </w:rPr>
+        <w:t>• Competencia 4 (Software): Solución Fullstack con Next.js 15, React 19, TypeScript y despliegue cloud en Vercel.</w:t>
+      </w:r>
+    </w:p>
+    <w:p>
+      <w:pPr>
+        <w:spacing w:before="200" w:after="60"/>
+      </w:pPr>
+      <w:r>
+        <w:rPr>
+          <w:rFonts w:ascii="Calibri" w:hAnsi="Calibri"/>
+          <w:b/>
+          <w:color w:val="0F172A"/>
+          <w:sz w:val="23"/>
+        </w:rPr>
+        <w:t>6.3. Conclusiones Individuales del Proyecto</w:t>
+      </w:r>
+    </w:p>
+    <w:p>
+      <w:pPr>
+        <w:spacing w:after="80" w:line="276" w:lineRule="auto"/>
+      </w:pPr>
+      <w:r>
+        <w:rPr>
+          <w:rFonts w:ascii="Calibri" w:hAnsi="Calibri"/>
+          <w:b w:val="0"/>
+          <w:i w:val="0"/>
+          <w:color w:val="1E293B"/>
+          <w:sz w:val="20"/>
+        </w:rPr>
+        <w:t>La Fase 2 cumplió el 100% de los requerimientos planificados con cero errores de compilación. La solución erradica la espera pasiva del técnico de soporte mediante validación QR en &lt; 30s y cómputo Delta T, integrando resiliencia corporativa mediante los 4 bots RPA, el Plan IRP bajo NIST SP 800-61 y el Gestor RBAC con doble verificación.</w:t>
+      </w:r>
+    </w:p>
+    <w:p>
+      <w:pPr>
+        <w:spacing w:before="200" w:after="60"/>
+      </w:pPr>
+      <w:r>
+        <w:rPr>
+          <w:rFonts w:ascii="Calibri" w:hAnsi="Calibri"/>
+          <w:b/>
+          <w:color w:val="0F172A"/>
+          <w:sz w:val="23"/>
+        </w:rPr>
+        <w:t>6.4. Reflexión Profesional Individual</w:t>
+      </w:r>
+    </w:p>
+    <w:p>
+      <w:pPr>
+        <w:spacing w:after="80" w:line="276" w:lineRule="auto"/>
+      </w:pPr>
+      <w:r>
+        <w:rPr>
+          <w:rFonts w:ascii="Calibri" w:hAnsi="Calibri"/>
+          <w:b w:val="0"/>
+          <w:i w:val="0"/>
+          <w:color w:val="1E293B"/>
+          <w:sz w:val="20"/>
+        </w:rPr>
+        <w:t>El desarrollo de esta etapa consolidó mi formación profesional en ingeniería de software, arquitectura cloud y ciberseguridad. Comprendí que la seguridad auténtica radica en salvaguardas estructurales embebidas en el backend y que la accesibilidad universal (WCAG 2.1 AA) es un imperativo ético de nuestra disciplina. Con la plataforma desplegada operativamente en local y en la nube, encaro la fase final del proyecto con absoluta solidez para titularme con distinción máxima.</w:t>
+      </w:r>
+    </w:p>
+    <w:p>
+      <w:pPr>
+        <w:spacing w:before="280" w:after="80"/>
+      </w:pPr>
+      <w:r>
+        <w:rPr>
+          <w:rFonts w:ascii="Calibri" w:hAnsi="Calibri"/>
+          <w:b/>
+          <w:color w:val="1E3A8A"/>
+          <w:sz w:val="28"/>
+        </w:rPr>
+        <w:t>PARTE VII: REFERENCIAS BIBLIOGRÁFICAS (NORMAS APA 7ª EDICIÓN)</w:t>
+      </w:r>
+    </w:p>
+    <w:p>
+      <w:pPr>
+        <w:spacing w:after="80" w:line="276" w:lineRule="auto"/>
+      </w:pPr>
+      <w:r>
+        <w:rPr>
+          <w:rFonts w:ascii="Calibri" w:hAnsi="Calibri"/>
+          <w:b w:val="0"/>
+          <w:i w:val="0"/>
+          <w:color w:val="1E293B"/>
+          <w:sz w:val="20"/>
+        </w:rPr>
+        <w:t>1. International Organization for Standardization. (2011). Systems and software engineering — Systems and software Quality Requirements and Evaluation (SQuaRE) — System and software quality models (ISO/IEC 25010:2011).</w:t>
+      </w:r>
+    </w:p>
+    <w:p>
+      <w:pPr>
+        <w:spacing w:after="80" w:line="276" w:lineRule="auto"/>
+      </w:pPr>
+      <w:r>
+        <w:rPr>
+          <w:rFonts w:ascii="Calibri" w:hAnsi="Calibri"/>
+          <w:b w:val="0"/>
+          <w:i w:val="0"/>
+          <w:color w:val="1E293B"/>
+          <w:sz w:val="20"/>
+        </w:rPr>
+        <w:t>2. National Institute of Standards and Technology. (2012). Computer Security Incident Handling Guide (NIST SP 800-61 Rev. 2). U.S. Department of Commerce.</w:t>
+      </w:r>
+    </w:p>
+    <w:p>
+      <w:pPr>
+        <w:spacing w:after="80" w:line="276" w:lineRule="auto"/>
+      </w:pPr>
+      <w:r>
+        <w:rPr>
+          <w:rFonts w:ascii="Calibri" w:hAnsi="Calibri"/>
+          <w:b w:val="0"/>
+          <w:i w:val="0"/>
+          <w:color w:val="1E293B"/>
+          <w:sz w:val="20"/>
+        </w:rPr>
+        <w:t>3. Open Web Application Security Project. (2021). OWASP Top 10: The Ten Most Critical Web Application Security Risks.</w:t>
+      </w:r>
+    </w:p>
+    <w:p>
+      <w:pPr>
+        <w:spacing w:after="80" w:line="276" w:lineRule="auto"/>
+      </w:pPr>
+      <w:r>
+        <w:rPr>
+          <w:rFonts w:ascii="Calibri" w:hAnsi="Calibri"/>
+          <w:b w:val="0"/>
+          <w:i w:val="0"/>
+          <w:color w:val="1E293B"/>
+          <w:sz w:val="20"/>
+        </w:rPr>
+        <w:t>4. International Organization for Standardization. (2022). Information security management systems (ISO/IEC 27001:2022).</w:t>
+      </w:r>
+    </w:p>
+    <w:p>
+      <w:pPr>
+        <w:spacing w:after="80" w:line="276" w:lineRule="auto"/>
+      </w:pPr>
+      <w:r>
+        <w:rPr>
+          <w:rFonts w:ascii="Calibri" w:hAnsi="Calibri"/>
+          <w:b w:val="0"/>
+          <w:i w:val="0"/>
+          <w:color w:val="1E293B"/>
+          <w:sz w:val="20"/>
+        </w:rPr>
+        <w:t>5. Next.js Documentation Team. (2025). Next.js 15 Architecture, App Router, and Server Actions Reference. Vercel Inc.</w:t>
+      </w:r>
+    </w:p>
+    <w:p>
+      <w:pPr>
+        <w:spacing w:after="80" w:line="276" w:lineRule="auto"/>
+      </w:pPr>
+      <w:r>
+        <w:rPr>
+          <w:rFonts w:ascii="Calibri" w:hAnsi="Calibri"/>
+          <w:b w:val="0"/>
+          <w:i w:val="0"/>
+          <w:color w:val="1E293B"/>
+          <w:sz w:val="20"/>
+        </w:rPr>
+        <w:t>6. Prisma Data Inc. (2025). Prisma Client: Next-generation ORM for Node.js and TypeScript.</w:t>
+      </w:r>
+    </w:p>
+    <w:p>
+      <w:pPr>
+        <w:spacing w:after="80" w:line="276" w:lineRule="auto"/>
+      </w:pPr>
+      <w:r>
+        <w:rPr>
+          <w:rFonts w:ascii="Calibri" w:hAnsi="Calibri"/>
+          <w:b w:val="0"/>
+          <w:i w:val="0"/>
+          <w:color w:val="1E293B"/>
+          <w:sz w:val="20"/>
+        </w:rPr>
+        <w:t>7. Pressman, R. S., &amp; Maxim, B. R. (2020). Ingeniería del software: Un enfoque práctico (9ª ed.). McGraw-Hill Education.</w:t>
+      </w:r>
+    </w:p>
+    <w:p>
+      <w:pPr>
+        <w:spacing w:after="80" w:line="276" w:lineRule="auto"/>
+      </w:pPr>
+      <w:r>
+        <w:rPr>
+          <w:rFonts w:ascii="Calibri" w:hAnsi="Calibri"/>
+          <w:b w:val="0"/>
+          <w:i w:val="0"/>
+          <w:color w:val="1E293B"/>
+          <w:sz w:val="20"/>
+        </w:rPr>
+        <w:t>8. Sommerville, I. (2016). Ingeniería del software (10ª ed.). Pearson Education.</w:t>
+      </w:r>
+    </w:p>
+    <w:p>
+      <w:pPr>
+        <w:spacing w:after="80" w:line="276" w:lineRule="auto"/>
+      </w:pPr>
+      <w:r>
+        <w:rPr>
+          <w:rFonts w:ascii="Calibri" w:hAnsi="Calibri"/>
+          <w:b w:val="0"/>
+          <w:i w:val="0"/>
+          <w:color w:val="1E293B"/>
+          <w:sz w:val="20"/>
+        </w:rPr>
+        <w:t>9. World Wide Web Consortium. (2018). Web Content Accessibility Guidelines (WCAG) 2.1.</w:t>
       </w:r>
     </w:p>
     <w:sectPr>

</xml_diff>